<commit_message>
Gráficos refeitos com seaborn e desenho mais didático
- Curvas de validação em painéis por família de modelo, mesmo eixo y,
  sem escala logarítmica e com o valor final escrito em cada curva
- Treino x validação com a diferença sombreada e resumo da última época
- Acurácia por classe em gráfico de halteres, com o ganho da ResNet18
- Matrizes de confusão com seaborn heatmap; vírgula decimal em tudo
- Legendas do relatório e do README atualizadas; PDF e DOCX regenerados

Co-Authored-By: Claude Opus 5.5 <noreply@anthropic.com>
</commit_message>
<xml_diff>
--- a/relatorio/Relatorio_APS_CNN.docx
+++ b/relatorio/Relatorio_APS_CNN.docx
@@ -3525,7 +3525,7 @@
       <w:r>
         <w:drawing>
           <wp:inline distT="0" distB="0" distL="0" distR="0">
-            <wp:extent cx="5759450" cy="1885808"/>
+            <wp:extent cx="5759450" cy="1936559"/>
             <wp:docPr id="1" name="Figura 1"/>
             <a:graphic xmlns:a="http://schemas.openxmlformats.org/drawingml/2006/main">
               <a:graphicData uri="http://schemas.openxmlformats.org/drawingml/2006/picture">
@@ -3543,7 +3543,7 @@
                   <pic:spPr>
                     <a:xfrm>
                       <a:off x="0" y="0"/>
-                      <a:ext cx="5759450" cy="1885808"/>
+                      <a:ext cx="5759450" cy="1936559"/>
                     </a:xfrm>
                     <a:prstGeom prst="rect">
                       <a:avLst/>
@@ -3587,7 +3587,7 @@
       <w:r>
         <w:drawing>
           <wp:inline distT="0" distB="0" distL="0" distR="0">
-            <wp:extent cx="5759450" cy="3954249"/>
+            <wp:extent cx="5759450" cy="3945669"/>
             <wp:docPr id="2" name="Figura 2"/>
             <a:graphic xmlns:a="http://schemas.openxmlformats.org/drawingml/2006/main">
               <a:graphicData uri="http://schemas.openxmlformats.org/drawingml/2006/picture">
@@ -3605,7 +3605,7 @@
                   <pic:spPr>
                     <a:xfrm>
                       <a:off x="0" y="0"/>
-                      <a:ext cx="5759450" cy="3954249"/>
+                      <a:ext cx="5759450" cy="3945669"/>
                     </a:xfrm>
                     <a:prstGeom prst="rect">
                       <a:avLst/>
@@ -3630,7 +3630,7 @@
         <w:t xml:space="preserve">Figura 2 — </w:t>
       </w:r>
       <w:r>
-        <w:t xml:space="preserve">Acurácia e perda na validação por época. A ResNet18 pré-treinada já começa em um patamar muito mais alto; a MinhaCNN precisa de dezenas de épocas para convergir.</w:t>
+        <w:t xml:space="preserve">Acurácia na validação por época. À esquerda, as CNNs próprias; à direita, as variantes da ResNet18, com o mesmo eixo vertical. A ResNet18 pré-treinada já começa em um patamar muito mais alto; a MinhaCNN precisa de dezenas de épocas para convergir.</w:t>
       </w:r>
     </w:p>
     <w:p>
@@ -3656,7 +3656,7 @@
       <w:r>
         <w:drawing>
           <wp:inline distT="0" distB="0" distL="0" distR="0">
-            <wp:extent cx="5759450" cy="2191882"/>
+            <wp:extent cx="5759450" cy="2275202"/>
             <wp:docPr id="3" name="Figura 3"/>
             <a:graphic xmlns:a="http://schemas.openxmlformats.org/drawingml/2006/main">
               <a:graphicData uri="http://schemas.openxmlformats.org/drawingml/2006/picture">
@@ -3674,7 +3674,7 @@
                   <pic:spPr>
                     <a:xfrm>
                       <a:off x="0" y="0"/>
-                      <a:ext cx="5759450" cy="2191882"/>
+                      <a:ext cx="5759450" cy="2275202"/>
                     </a:xfrm>
                     <a:prstGeom prst="rect">
                       <a:avLst/>
@@ -3699,7 +3699,7 @@
         <w:t xml:space="preserve">Figura 3 — </w:t>
       </w:r>
       <w:r>
-        <w:t xml:space="preserve">Acurácia de treino (linha fina, com aumento de dados e dropout ativos) e de validação (linha grossa) no CIFAR-10. Na MinhaCNN o treino fica abaixo da validação durante boa parte do treino, efeito da regularização.</w:t>
+        <w:t xml:space="preserve">Acurácia de treino (linha clara, com aumento de dados e dropout ativos) e de validação (linha escura) no CIFAR-10; a área sombreada é a diferença entre as duas. Na MinhaCNN o treino fica abaixo da validação durante boa parte do treino, efeito da regularização.</w:t>
       </w:r>
     </w:p>
     <w:p>
@@ -3718,7 +3718,7 @@
       <w:r>
         <w:drawing>
           <wp:inline distT="0" distB="0" distL="0" distR="0">
-            <wp:extent cx="5759450" cy="2624882"/>
+            <wp:extent cx="5759450" cy="4067525"/>
             <wp:docPr id="4" name="Figura 4"/>
             <a:graphic xmlns:a="http://schemas.openxmlformats.org/drawingml/2006/main">
               <a:graphicData uri="http://schemas.openxmlformats.org/drawingml/2006/picture">
@@ -3736,7 +3736,7 @@
                   <pic:spPr>
                     <a:xfrm>
                       <a:off x="0" y="0"/>
-                      <a:ext cx="5759450" cy="2624882"/>
+                      <a:ext cx="5759450" cy="4067525"/>
                     </a:xfrm>
                     <a:prstGeom prst="rect">
                       <a:avLst/>
@@ -3761,7 +3761,7 @@
         <w:t xml:space="preserve">Figura 4 — </w:t>
       </w:r>
       <w:r>
-        <w:t xml:space="preserve">Acurácia por classe no teste do CIFAR-10.</w:t>
+        <w:t xml:space="preserve">Acurácia por classe no teste do CIFAR-10, da classe mais fácil para a mais difícil. À direita, quanto a ResNet18 acerta a mais em cada classe.</w:t>
       </w:r>
     </w:p>
     <w:p>
@@ -3805,7 +3805,7 @@
       <w:r>
         <w:drawing>
           <wp:inline distT="0" distB="0" distL="0" distR="0">
-            <wp:extent cx="5759450" cy="2724934"/>
+            <wp:extent cx="5759450" cy="2886302"/>
             <wp:docPr id="5" name="Figura 5"/>
             <a:graphic xmlns:a="http://schemas.openxmlformats.org/drawingml/2006/main">
               <a:graphicData uri="http://schemas.openxmlformats.org/drawingml/2006/picture">
@@ -3823,7 +3823,7 @@
                   <pic:spPr>
                     <a:xfrm>
                       <a:off x="0" y="0"/>
-                      <a:ext cx="5759450" cy="2724934"/>
+                      <a:ext cx="5759450" cy="2886302"/>
                     </a:xfrm>
                     <a:prstGeom prst="rect">
                       <a:avLst/>
@@ -3874,7 +3874,7 @@
       <w:r>
         <w:drawing>
           <wp:inline distT="0" distB="0" distL="0" distR="0">
-            <wp:extent cx="5759450" cy="2848423"/>
+            <wp:extent cx="5759450" cy="2804428"/>
             <wp:docPr id="6" name="Figura 6"/>
             <a:graphic xmlns:a="http://schemas.openxmlformats.org/drawingml/2006/main">
               <a:graphicData uri="http://schemas.openxmlformats.org/drawingml/2006/picture">
@@ -3892,7 +3892,7 @@
                   <pic:spPr>
                     <a:xfrm>
                       <a:off x="0" y="0"/>
-                      <a:ext cx="5759450" cy="2848423"/>
+                      <a:ext cx="5759450" cy="2804428"/>
                     </a:xfrm>
                     <a:prstGeom prst="rect">
                       <a:avLst/>
@@ -3936,7 +3936,7 @@
       <w:r>
         <w:drawing>
           <wp:inline distT="0" distB="0" distL="0" distR="0">
-            <wp:extent cx="5759450" cy="2733350"/>
+            <wp:extent cx="5759450" cy="2906217"/>
             <wp:docPr id="7" name="Figura 7"/>
             <a:graphic xmlns:a="http://schemas.openxmlformats.org/drawingml/2006/main">
               <a:graphicData uri="http://schemas.openxmlformats.org/drawingml/2006/picture">
@@ -3954,7 +3954,7 @@
                   <pic:spPr>
                     <a:xfrm>
                       <a:off x="0" y="0"/>
-                      <a:ext cx="5759450" cy="2733350"/>
+                      <a:ext cx="5759450" cy="2906217"/>
                     </a:xfrm>
                     <a:prstGeom prst="rect">
                       <a:avLst/>
@@ -3990,7 +3990,7 @@
       <w:r>
         <w:drawing>
           <wp:inline distT="0" distB="0" distL="0" distR="0">
-            <wp:extent cx="5759450" cy="2845293"/>
+            <wp:extent cx="5759450" cy="2798746"/>
             <wp:docPr id="8" name="Figura 8"/>
             <a:graphic xmlns:a="http://schemas.openxmlformats.org/drawingml/2006/main">
               <a:graphicData uri="http://schemas.openxmlformats.org/drawingml/2006/picture">
@@ -4008,7 +4008,7 @@
                   <pic:spPr>
                     <a:xfrm>
                       <a:off x="0" y="0"/>
-                      <a:ext cx="5759450" cy="2845293"/>
+                      <a:ext cx="5759450" cy="2798746"/>
                     </a:xfrm>
                     <a:prstGeom prst="rect">
                       <a:avLst/>
@@ -4058,7 +4058,7 @@
       <w:r>
         <w:drawing>
           <wp:inline distT="0" distB="0" distL="0" distR="0">
-            <wp:extent cx="5759450" cy="3092005"/>
+            <wp:extent cx="5759450" cy="3251243"/>
             <wp:docPr id="9" name="Figura 9"/>
             <a:graphic xmlns:a="http://schemas.openxmlformats.org/drawingml/2006/main">
               <a:graphicData uri="http://schemas.openxmlformats.org/drawingml/2006/picture">
@@ -4076,7 +4076,7 @@
                   <pic:spPr>
                     <a:xfrm>
                       <a:off x="0" y="0"/>
-                      <a:ext cx="5759450" cy="3092005"/>
+                      <a:ext cx="5759450" cy="3251243"/>
                     </a:xfrm>
                     <a:prstGeom prst="rect">
                       <a:avLst/>
@@ -4126,7 +4126,7 @@
       <w:r>
         <w:drawing>
           <wp:inline distT="0" distB="0" distL="0" distR="0">
-            <wp:extent cx="5759450" cy="2205746"/>
+            <wp:extent cx="5759450" cy="2275202"/>
             <wp:docPr id="10" name="Figura 10"/>
             <a:graphic xmlns:a="http://schemas.openxmlformats.org/drawingml/2006/main">
               <a:graphicData uri="http://schemas.openxmlformats.org/drawingml/2006/picture">
@@ -4144,7 +4144,7 @@
                   <pic:spPr>
                     <a:xfrm>
                       <a:off x="0" y="0"/>
-                      <a:ext cx="5759450" cy="2205746"/>
+                      <a:ext cx="5759450" cy="2275202"/>
                     </a:xfrm>
                     <a:prstGeom prst="rect">
                       <a:avLst/>
@@ -4169,7 +4169,7 @@
         <w:t xml:space="preserve">Figura 10 — </w:t>
       </w:r>
       <w:r>
-        <w:t xml:space="preserve">MinhaCNN com e sem regularização no CIFAR-10. Sem regularização a rede decora o treino (100% de acurácia, perda ~10⁻⁴) enquanto a validação estaciona em ~87%.</w:t>
+        <w:t xml:space="preserve">MinhaCNN com e sem regularização no CIFAR-10: acurácia de treino (linha clara) e de validação (linha escura). Sem regularização a rede decora o treino (100%) enquanto a validação para em ~87%; a diferença chega a 13 p.p.</w:t>
       </w:r>
     </w:p>
     <w:tbl>

</xml_diff>

<commit_message>
Relatórios: nome do integrante e link do repositório
Co-Authored-By: Claude Opus 5.5 <noreply@anthropic.com>
</commit_message>
<xml_diff>
--- a/relatorio/Relatorio_APS_CNN.docx
+++ b/relatorio/Relatorio_APS_CNN.docx
@@ -34,16 +34,10 @@
         <w:rPr>
           <w:b/>
         </w:rPr>
-        <w:t xml:space="preserve">Integrantes:</w:t>
-      </w:r>
-      <w:r>
-        <w:t xml:space="preserve"> </w:t>
-      </w:r>
-      <w:r>
-        <w:rPr>
-          <w:i/>
-        </w:rPr>
-        <w:t xml:space="preserve">(preencher com os nomes do grupo)</w:t>
+        <w:t xml:space="preserve">Integrante:</w:t>
+      </w:r>
+      <w:r>
+        <w:t xml:space="preserve"> João Henrique dos Santos Silva</w:t>
       </w:r>
     </w:p>
     <w:p>
@@ -57,13 +51,7 @@
         <w:t xml:space="preserve">Repositório:</w:t>
       </w:r>
       <w:r>
-        <w:t xml:space="preserve"> </w:t>
-      </w:r>
-      <w:r>
-        <w:rPr>
-          <w:i/>
-        </w:rPr>
-        <w:t xml:space="preserve">(preencher com o link do GitHub)</w:t>
+        <w:t xml:space="preserve"> https://github.com/soninhoxs/APS_CNN_MNIST_CIFAR10</w:t>
       </w:r>
     </w:p>
     <w:p>
@@ -5567,16 +5555,7 @@
     <w:p>
       <w:pPr/>
       <w:r>
-        <w:t xml:space="preserve">Todo o código está no repositório do grupo </w:t>
-      </w:r>
-      <w:r>
-        <w:rPr>
-          <w:i/>
-        </w:rPr>
-        <w:t xml:space="preserve">(link)</w:t>
-      </w:r>
-      <w:r>
-        <w:t xml:space="preserve">. Estrutura principal:</w:t>
+        <w:t xml:space="preserve">Todo o código está no repositório https://github.com/soninhoxs/APS_CNN_MNIST_CIFAR10. Estrutura principal:</w:t>
       </w:r>
     </w:p>
     <w:tbl>

</xml_diff>